<commit_message>
Add Failuerc bot features without deploy archive
Co-authored-by: Cursor <cursoragent@cursor.com>
</commit_message>
<xml_diff>
--- a/Portfolio-owner/curriculo-carta/JuliaReboucasLeite_Curriculum.docx
+++ b/Portfolio-owner/curriculo-carta/JuliaReboucasLeite_Curriculum.docx
@@ -52,27 +52,7 @@
             <w:sz w:val="20"/>
             <w:lang w:val="en-US"/>
           </w:rPr>
-          <w:t>/in/</w:t>
-        </w:r>
-        <w:proofErr w:type="spellStart"/>
-        <w:r>
-          <w:rPr>
-            <w:rStyle w:val="Hiperligao"/>
-            <w:rFonts w:ascii="Calibri" w:eastAsia="Calibri" w:hAnsi="Calibri" w:cs="Calibri"/>
-            <w:sz w:val="20"/>
-            <w:lang w:val="en-US"/>
-          </w:rPr>
-          <w:t>juliareboucasleite</w:t>
-        </w:r>
-        <w:proofErr w:type="spellEnd"/>
-        <w:r>
-          <w:rPr>
-            <w:rStyle w:val="Hiperligao"/>
-            <w:rFonts w:ascii="Calibri" w:eastAsia="Calibri" w:hAnsi="Calibri" w:cs="Calibri"/>
-            <w:sz w:val="20"/>
-            <w:lang w:val="en-US"/>
-          </w:rPr>
-          <w:t>/</w:t>
+          <w:t>/in/juliareboucasleite/</w:t>
         </w:r>
       </w:hyperlink>
       <w:r>
@@ -91,19 +71,8 @@
             <w:sz w:val="20"/>
             <w:lang w:val="en-US"/>
           </w:rPr>
-          <w:t>github.com/</w:t>
+          <w:t>github.com/juliareboucasleite</w:t>
         </w:r>
-        <w:proofErr w:type="spellStart"/>
-        <w:r>
-          <w:rPr>
-            <w:rStyle w:val="Hiperligao"/>
-            <w:rFonts w:ascii="Calibri" w:eastAsia="Calibri" w:hAnsi="Calibri" w:cs="Calibri"/>
-            <w:sz w:val="20"/>
-            <w:lang w:val="en-US"/>
-          </w:rPr>
-          <w:t>juliareboucasleite</w:t>
-        </w:r>
-        <w:proofErr w:type="spellEnd"/>
       </w:hyperlink>
     </w:p>
     <w:p>
@@ -210,16 +179,7 @@
         <w:jc w:val="both"/>
       </w:pPr>
       <w:r>
-        <w:t>Resumo</w:t>
-      </w:r>
-    </w:p>
-    <w:p>
-      <w:pPr>
-        <w:spacing w:line="360" w:lineRule="auto"/>
-        <w:jc w:val="both"/>
-      </w:pPr>
-      <w:r>
-        <w:t>Estudante com forte sentido de responsabilidade, boa capacidade de comunicação e facilidade em lidar com o público. Tenho experiência em trabalho com equipas, adaptação a diferentes contextos e aprendizagem rápida de novas tarefas. Procuro uma oportunidade onde possa crescer profissionalmente, contribuir com uma atitude positiva e oferecer um bom atendimento ao cliente.</w:t>
+        <w:t>About me</w:t>
       </w:r>
     </w:p>
     <w:p>
@@ -227,12 +187,44 @@
         <w:pStyle w:val="Ttulo1"/>
         <w:spacing w:line="360" w:lineRule="auto"/>
         <w:jc w:val="both"/>
+        <w:rPr>
+          <w:rFonts w:ascii="Calibri" w:eastAsia="Calibri" w:hAnsi="Calibri" w:cs="Calibri"/>
+          <w:b w:val="0"/>
+          <w:sz w:val="20"/>
+          <w:lang w:val="en-US"/>
+        </w:rPr>
+      </w:pPr>
+      <w:r>
+        <w:rPr>
+          <w:rFonts w:ascii="Calibri" w:eastAsia="Calibri" w:hAnsi="Calibri" w:cs="Calibri"/>
+          <w:b w:val="0"/>
+          <w:sz w:val="20"/>
+          <w:lang w:val="en-US"/>
+        </w:rPr>
+        <w:t>Student with a strong sense of responsibility, good communication skills, and ease in dealing with the public. I have experience working in teams, adapting to different contexts, and learning new tasks quickly. I am looking for an opportunity where I can grow professionally, contribute with a positive attitude, and offer excellent customer service.</w:t>
+      </w:r>
+    </w:p>
+    <w:p>
+      <w:pPr>
+        <w:rPr>
+          <w:lang w:val="en-US"/>
+        </w:rPr>
+      </w:pPr>
+    </w:p>
+    <w:p>
+      <w:pPr>
+        <w:pStyle w:val="Ttulo1"/>
+        <w:spacing w:line="360" w:lineRule="auto"/>
+        <w:jc w:val="both"/>
       </w:pPr>
       <w:r>
         <w:t>Educa</w:t>
       </w:r>
       <w:r>
-        <w:t>ção</w:t>
+        <w:t>t</w:t>
+      </w:r>
+      <w:r>
+        <w:t>ion</w:t>
       </w:r>
     </w:p>
     <w:p>
@@ -264,7 +256,21 @@
           <w:b/>
           <w:sz w:val="28"/>
         </w:rPr>
-        <w:t xml:space="preserve">- </w:t>
+        <w:t>-</w:t>
+      </w:r>
+      <w:r>
+        <w:rPr>
+          <w:b/>
+          <w:sz w:val="28"/>
+        </w:rPr>
+        <w:t xml:space="preserve"> </w:t>
+      </w:r>
+      <w:r>
+        <w:rPr>
+          <w:b/>
+          <w:sz w:val="28"/>
+        </w:rPr>
+        <w:t xml:space="preserve">Portugal, </w:t>
       </w:r>
       <w:r>
         <w:rPr>
@@ -290,24 +296,44 @@
         <w:spacing w:line="360" w:lineRule="auto"/>
         <w:ind w:left="0" w:firstLine="0"/>
         <w:jc w:val="both"/>
-      </w:pPr>
-      <w:r>
-        <w:t>Curso Profissional Técnico de Gestão e Programação de Sistemas Informáticos</w:t>
-      </w:r>
-      <w:r>
+        <w:rPr>
+          <w:lang w:val="en-US"/>
+        </w:rPr>
+      </w:pPr>
+      <w:r>
+        <w:rPr>
+          <w:sz w:val="28"/>
+          <w:szCs w:val="28"/>
+          <w:lang w:val="en-US"/>
+        </w:rPr>
+        <w:t>Professional Software Development Course</w:t>
+      </w:r>
+      <w:r>
+        <w:rPr>
+          <w:lang w:val="en-US"/>
+        </w:rPr>
         <w:tab/>
       </w:r>
       <w:r>
         <w:rPr>
           <w:sz w:val="20"/>
-        </w:rPr>
-        <w:t>2023 – 2026 (em curs</w:t>
+          <w:lang w:val="en-US"/>
+        </w:rPr>
+        <w:t>2023 – 2026 (</w:t>
       </w:r>
       <w:r>
         <w:rPr>
           <w:sz w:val="20"/>
-        </w:rPr>
-        <w:t>o)</w:t>
+          <w:lang w:val="en-US"/>
+        </w:rPr>
+        <w:t>ongoing</w:t>
+      </w:r>
+      <w:r>
+        <w:rPr>
+          <w:sz w:val="20"/>
+          <w:lang w:val="en-US"/>
+        </w:rPr>
+        <w:t>)</w:t>
       </w:r>
     </w:p>
     <w:p>
@@ -316,18 +342,20 @@
         <w:jc w:val="both"/>
         <w:rPr>
           <w:b/>
-        </w:rPr>
-      </w:pPr>
-      <w:r>
-        <w:t>Formação em desenvolvimento web, aplicações em C#/.NET, bases de dados (</w:t>
-      </w:r>
-      <w:proofErr w:type="spellStart"/>
-      <w:r>
-        <w:t>MySQL</w:t>
-      </w:r>
-      <w:proofErr w:type="spellEnd"/>
-      <w:r>
-        <w:t>, SQL Server) e automação com Python e Selenium.</w:t>
+          <w:lang w:val="en-US"/>
+        </w:rPr>
+      </w:pPr>
+      <w:r>
+        <w:rPr>
+          <w:lang w:val="en-US"/>
+        </w:rPr>
+        <w:t>Training in web development, C#/.NET applications, databases (MySQL, SQL Server), and automation with Python and Selenium</w:t>
+      </w:r>
+      <w:r>
+        <w:rPr>
+          <w:lang w:val="en-US"/>
+        </w:rPr>
+        <w:t>.</w:t>
       </w:r>
     </w:p>
     <w:p>
@@ -335,12 +363,21 @@
         <w:pStyle w:val="Ttulo1"/>
         <w:spacing w:line="360" w:lineRule="auto"/>
         <w:jc w:val="both"/>
-      </w:pPr>
-      <w:r>
+        <w:rPr>
+          <w:lang w:val="en-US"/>
+        </w:rPr>
+      </w:pPr>
+      <w:r>
+        <w:rPr>
+          <w:lang w:val="en-US"/>
+        </w:rPr>
         <w:t>Proje</w:t>
       </w:r>
       <w:r>
-        <w:t>tos</w:t>
+        <w:rPr>
+          <w:lang w:val="en-US"/>
+        </w:rPr>
+        <w:t>cts</w:t>
       </w:r>
     </w:p>
     <w:p>
@@ -352,21 +389,57 @@
         <w:spacing w:line="360" w:lineRule="auto"/>
         <w:ind w:left="0" w:firstLine="0"/>
         <w:jc w:val="both"/>
+        <w:rPr>
+          <w:lang w:val="en-US"/>
+        </w:rPr>
       </w:pPr>
       <w:r>
         <w:rPr>
           <w:sz w:val="28"/>
-        </w:rPr>
-        <w:t>PromoPing – Sistema de Monitorização de Preços</w:t>
-      </w:r>
-      <w:r>
+          <w:lang w:val="en-US"/>
+        </w:rPr>
+        <w:t xml:space="preserve">PromoPing </w:t>
+      </w:r>
+      <w:r>
+        <w:rPr>
+          <w:sz w:val="28"/>
+          <w:lang w:val="en-US"/>
+        </w:rPr>
+        <w:t xml:space="preserve">- </w:t>
+      </w:r>
+      <w:r>
+        <w:rPr>
+          <w:sz w:val="28"/>
+          <w:lang w:val="en-US"/>
+        </w:rPr>
+        <w:t>Price Monitoring System</w:t>
+      </w:r>
+      <w:r>
+        <w:rPr>
+          <w:lang w:val="en-US"/>
+        </w:rPr>
         <w:tab/>
       </w:r>
       <w:r>
         <w:rPr>
           <w:sz w:val="20"/>
-        </w:rPr>
-        <w:t>(Projeto PAP 2025/2026)</w:t>
+          <w:lang w:val="en-US"/>
+        </w:rPr>
+        <w:t>(Proje</w:t>
+      </w:r>
+      <w:r>
+        <w:rPr>
+          <w:sz w:val="20"/>
+          <w:lang w:val="en-US"/>
+        </w:rPr>
+        <w:t>ct</w:t>
+      </w:r>
+      <w:r>
+        <w:rPr>
+          <w:sz w:val="20"/>
+          <w:lang w:val="en-US"/>
+        </w:rPr>
+        <w:t xml:space="preserve"> PAP 2025/2026)</w:t>
       </w:r>
     </w:p>
     <w:p>
@@ -379,43 +452,13 @@
         <w:jc w:val="both"/>
       </w:pPr>
       <w:r>
-        <w:t xml:space="preserve">Desenvolvimento de uma plataforma completa de monitorização de preços com scraping automatizado, notificações via email e Discord e autenticação OAuth2 (Google/Discord). Implementação de múltiplos painéis administrativos e dois </w:t>
-      </w:r>
-      <w:proofErr w:type="spellStart"/>
-      <w:r>
-        <w:t>bots</w:t>
-      </w:r>
-      <w:proofErr w:type="spellEnd"/>
-      <w:r>
-        <w:t xml:space="preserve"> Discord (Java para gestão corporativa e JavaScript para notificações e moderação). </w:t>
-      </w:r>
-      <w:proofErr w:type="spellStart"/>
-      <w:r>
-        <w:t>Backend</w:t>
-      </w:r>
-      <w:proofErr w:type="spellEnd"/>
-      <w:r>
-        <w:t xml:space="preserve"> em Node.js, automação em Python (Selenium), painel em C# e app mobile em </w:t>
-      </w:r>
-      <w:proofErr w:type="spellStart"/>
-      <w:r>
-        <w:t>Kotlin</w:t>
-      </w:r>
-      <w:proofErr w:type="spellEnd"/>
-      <w:r>
-        <w:t>.</w:t>
-      </w:r>
-      <w:r>
-        <w:t xml:space="preserve"> </w:t>
-      </w:r>
-      <w:r>
-        <w:t>Sistema funcional com integração entre múltiplos serviços e testado com utilizadores reais.</w:t>
-      </w:r>
-      <w:r>
-        <w:t xml:space="preserve"> </w:t>
-      </w:r>
-      <w:r>
-        <w:t>Arquitetura modular baseada em múltiplos serviços integrados.</w:t>
+        <w:rPr>
+          <w:lang w:val="en-US"/>
+        </w:rPr>
+        <w:t xml:space="preserve">Development of a complete price monitoring platform with automated scraping, email and Discord notifications, and OAuth2 authentication (Google/Discord). Implementation of multiple administrative dashboards and two Discord bots (Java for corporate management and JavaScript for notifications and moderation). Backend in Node.js, automation in Python (Selenium), dashboard in C#, and mobile app in Kotlin. Functional system with integration between multiple services and tested with real users. </w:t>
+      </w:r>
+      <w:r>
+        <w:t>Modular architecture based on multiple integrated services.</w:t>
       </w:r>
     </w:p>
     <w:p>
@@ -427,41 +470,66 @@
         <w:spacing w:line="360" w:lineRule="auto"/>
         <w:ind w:left="0" w:firstLine="0"/>
         <w:jc w:val="both"/>
-      </w:pPr>
-      <w:proofErr w:type="spellStart"/>
+        <w:rPr>
+          <w:lang w:val="en-US"/>
+        </w:rPr>
+      </w:pPr>
       <w:r>
         <w:rPr>
           <w:sz w:val="28"/>
           <w:szCs w:val="28"/>
-        </w:rPr>
-        <w:t>CodePad</w:t>
-      </w:r>
-      <w:proofErr w:type="spellEnd"/>
+          <w:lang w:val="en-US"/>
+        </w:rPr>
+        <w:t xml:space="preserve">CodePad </w:t>
+      </w:r>
       <w:r>
         <w:rPr>
           <w:sz w:val="28"/>
           <w:szCs w:val="28"/>
-        </w:rPr>
-        <w:t xml:space="preserve"> – Editor de Texto em Java</w:t>
-      </w:r>
-      <w:r>
+          <w:lang w:val="en-US"/>
+        </w:rPr>
+        <w:t>-</w:t>
+      </w:r>
+      <w:r>
+        <w:rPr>
+          <w:sz w:val="28"/>
+          <w:szCs w:val="28"/>
+          <w:lang w:val="en-US"/>
+        </w:rPr>
+        <w:t xml:space="preserve"> </w:t>
+      </w:r>
+      <w:r>
+        <w:rPr>
+          <w:sz w:val="28"/>
+          <w:szCs w:val="28"/>
+          <w:lang w:val="en-US"/>
+        </w:rPr>
+        <w:t>Text Editor in Java</w:t>
+      </w:r>
+      <w:r>
+        <w:rPr>
+          <w:lang w:val="en-US"/>
+        </w:rPr>
         <w:tab/>
       </w:r>
       <w:r>
         <w:rPr>
           <w:sz w:val="20"/>
+          <w:lang w:val="en-US"/>
         </w:rPr>
         <w:t>2026 (</w:t>
       </w:r>
       <w:r>
         <w:rPr>
           <w:sz w:val="20"/>
-        </w:rPr>
-        <w:t>em desenvolvimento</w:t>
+          <w:lang w:val="en-US"/>
+        </w:rPr>
+        <w:t>developing</w:t>
       </w:r>
       <w:r>
         <w:rPr>
           <w:sz w:val="20"/>
+          <w:lang w:val="en-US"/>
         </w:rPr>
         <w:t>)</w:t>
       </w:r>
@@ -472,46 +540,20 @@
         <w:ind w:firstLine="31"/>
         <w:jc w:val="both"/>
         <w:rPr>
-          <w:b/>
-        </w:rPr>
-      </w:pPr>
-      <w:r>
-        <w:t xml:space="preserve">Desenvolvimento de um editor de texto e código desktop em </w:t>
-      </w:r>
-      <w:proofErr w:type="spellStart"/>
-      <w:r>
-        <w:t>JavaFX</w:t>
-      </w:r>
-      <w:proofErr w:type="spellEnd"/>
-      <w:r>
-        <w:t xml:space="preserve"> com suporte a múltiplas abas, destaque de sintaxe, </w:t>
-      </w:r>
-      <w:proofErr w:type="spellStart"/>
-      <w:r>
-        <w:t>auto-complete</w:t>
-      </w:r>
-      <w:proofErr w:type="spellEnd"/>
-      <w:r>
-        <w:t xml:space="preserve">, </w:t>
-      </w:r>
-      <w:proofErr w:type="spellStart"/>
-      <w:r>
-        <w:t>snippets</w:t>
-      </w:r>
-      <w:proofErr w:type="spellEnd"/>
-      <w:r>
-        <w:t xml:space="preserve"> e execução de código (Java, Python e JavaScript). Inclui funcionalidades como diferentes codificações (UTF-8, ANSI), controlo de quebra de linha, temas (claro/escuro), zoom e busca/substituição. Projeto com distribuição via executável (.exe) e estrutura organizada para colaboração.</w:t>
-      </w:r>
-    </w:p>
-    <w:p>
-      <w:pPr>
-        <w:pStyle w:val="Ttulo1"/>
-        <w:spacing w:line="360" w:lineRule="auto"/>
-        <w:jc w:val="both"/>
-      </w:pPr>
-      <w:r>
-        <w:lastRenderedPageBreak/>
-        <w:t>Experiências</w:t>
+          <w:lang w:val="en-US"/>
+        </w:rPr>
+      </w:pPr>
+      <w:r>
+        <w:rPr>
+          <w:lang w:val="en-US"/>
+        </w:rPr>
+        <w:t xml:space="preserve">Development of a JavaFX desktop text and code editor with support for multiple tabs, syntax highlighting, auto-complete, snippets, and code execution (Java, Python, and JavaScript). Includes features such as different encodings (UTF-8, ANSI), line break control, themes (light/dark), zoom, and search/replace. Project with distribution via executable (.exe) and an organized structure for </w:t>
+      </w:r>
+      <w:r>
+        <w:rPr>
+          <w:lang w:val="en-US"/>
+        </w:rPr>
+        <w:t>collaboration.</w:t>
       </w:r>
     </w:p>
     <w:p>
@@ -523,52 +565,164 @@
         <w:spacing w:line="360" w:lineRule="auto"/>
         <w:ind w:left="0" w:firstLine="0"/>
         <w:jc w:val="both"/>
-      </w:pPr>
-      <w:proofErr w:type="spellStart"/>
+        <w:rPr>
+          <w:lang w:val="en-US"/>
+        </w:rPr>
+      </w:pPr>
       <w:r>
         <w:rPr>
           <w:sz w:val="28"/>
           <w:szCs w:val="28"/>
-        </w:rPr>
-        <w:t>FAmazing</w:t>
-      </w:r>
-      <w:proofErr w:type="spellEnd"/>
+          <w:lang w:val="en-US"/>
+        </w:rPr>
+        <w:lastRenderedPageBreak/>
+        <w:t>SpotCat</w:t>
+      </w:r>
       <w:r>
         <w:rPr>
           <w:sz w:val="28"/>
           <w:szCs w:val="28"/>
-        </w:rPr>
-        <w:t xml:space="preserve"> – Web </w:t>
-      </w:r>
-      <w:proofErr w:type="spellStart"/>
-      <w:r>
-        <w:rPr>
+          <w:lang w:val="en-US"/>
+        </w:rPr>
+        <w:t xml:space="preserve"> - </w:t>
+      </w:r>
+      <w:r>
+        <w:rPr>
+          <w:bCs/>
           <w:sz w:val="28"/>
           <w:szCs w:val="28"/>
-        </w:rPr>
-        <w:t>Developer</w:t>
-      </w:r>
-      <w:proofErr w:type="spellEnd"/>
+          <w:lang w:val="en-US"/>
+        </w:rPr>
+        <w:t>Spotify Lyrics on Discord Status</w:t>
+      </w:r>
+      <w:r>
+        <w:rPr>
+          <w:lang w:val="en-US"/>
+        </w:rPr>
+        <w:tab/>
+      </w:r>
+      <w:r>
+        <w:rPr>
+          <w:bCs/>
+          <w:sz w:val="20"/>
+          <w:szCs w:val="20"/>
+          <w:lang w:val="en-US"/>
+        </w:rPr>
+        <w:t>2026</w:t>
+      </w:r>
+      <w:r>
+        <w:rPr>
+          <w:bCs/>
+          <w:sz w:val="20"/>
+          <w:szCs w:val="20"/>
+          <w:lang w:val="en-US"/>
+        </w:rPr>
+        <w:t xml:space="preserve"> </w:t>
+      </w:r>
+      <w:r>
+        <w:rPr>
+          <w:sz w:val="20"/>
+          <w:lang w:val="en-US"/>
+        </w:rPr>
+        <w:t>(</w:t>
+      </w:r>
+      <w:r>
+        <w:rPr>
+          <w:sz w:val="20"/>
+          <w:lang w:val="en-US"/>
+        </w:rPr>
+        <w:t>ongoing</w:t>
+      </w:r>
+      <w:r>
+        <w:rPr>
+          <w:sz w:val="20"/>
+          <w:lang w:val="en-US"/>
+        </w:rPr>
+        <w:t>)</w:t>
+      </w:r>
+    </w:p>
+    <w:p>
+      <w:r>
+        <w:rPr>
+          <w:lang w:val="en-US"/>
+        </w:rPr>
+        <w:t xml:space="preserve">Development of a Windows desktop app (Electron, TypeScript, Node.js) that syncs Spotify track lyrics to Discord custom status in real time. Spotify/Discord API integration, OAuth2 auth, multi-source lyrics fetching, setup panel, and Windows distribution (installer + portable). </w:t>
+      </w:r>
+      <w:r>
+        <w:t>Personal project built while learning Electron.</w:t>
+      </w:r>
+    </w:p>
+    <w:p>
+      <w:pPr>
+        <w:rPr>
+          <w:lang w:val="en-US"/>
+        </w:rPr>
+      </w:pPr>
+    </w:p>
+    <w:p>
+      <w:pPr>
+        <w:pStyle w:val="Ttulo1"/>
+        <w:spacing w:line="360" w:lineRule="auto"/>
+        <w:jc w:val="both"/>
+        <w:rPr>
+          <w:lang w:val="en-US"/>
+        </w:rPr>
+      </w:pPr>
+      <w:r>
+        <w:rPr>
+          <w:lang w:val="en-US"/>
+        </w:rPr>
+        <w:t>P</w:t>
+      </w:r>
+      <w:r>
+        <w:rPr>
+          <w:lang w:val="en-US"/>
+        </w:rPr>
+        <w:t>rofessional experiences</w:t>
+      </w:r>
+    </w:p>
+    <w:p>
+      <w:pPr>
+        <w:pStyle w:val="Ttulo2"/>
+        <w:tabs>
+          <w:tab w:val="right" w:pos="10147"/>
+        </w:tabs>
+        <w:spacing w:line="360" w:lineRule="auto"/>
+        <w:ind w:left="0" w:firstLine="0"/>
+        <w:jc w:val="both"/>
+        <w:rPr>
+          <w:lang w:val="en-US"/>
+        </w:rPr>
+      </w:pPr>
       <w:r>
         <w:rPr>
           <w:sz w:val="28"/>
           <w:szCs w:val="28"/>
-        </w:rPr>
-        <w:t xml:space="preserve"> </w:t>
-      </w:r>
-      <w:proofErr w:type="spellStart"/>
+          <w:lang w:val="en-US"/>
+        </w:rPr>
+        <w:t xml:space="preserve">FAmazing </w:t>
+      </w:r>
       <w:r>
         <w:rPr>
           <w:sz w:val="28"/>
           <w:szCs w:val="28"/>
-        </w:rPr>
-        <w:t>Intern</w:t>
-      </w:r>
-      <w:proofErr w:type="spellEnd"/>
+          <w:lang w:val="en-US"/>
+        </w:rPr>
+        <w:t>-</w:t>
+      </w:r>
       <w:r>
         <w:rPr>
           <w:sz w:val="28"/>
           <w:szCs w:val="28"/>
+          <w:lang w:val="en-US"/>
+        </w:rPr>
+        <w:t xml:space="preserve"> Web Developer Intern</w:t>
+      </w:r>
+      <w:r>
+        <w:rPr>
+          <w:sz w:val="28"/>
+          <w:szCs w:val="28"/>
+          <w:lang w:val="en-US"/>
         </w:rPr>
         <w:t xml:space="preserve"> (FCT)</w:t>
       </w:r>
@@ -578,41 +732,34 @@
           <w:bCs/>
           <w:sz w:val="28"/>
           <w:szCs w:val="28"/>
+          <w:lang w:val="en-US"/>
         </w:rPr>
         <w:t xml:space="preserve"> </w:t>
       </w:r>
       <w:r>
+        <w:rPr>
+          <w:lang w:val="en-US"/>
+        </w:rPr>
         <w:tab/>
       </w:r>
       <w:r>
         <w:rPr>
           <w:sz w:val="20"/>
+          <w:lang w:val="en-US"/>
         </w:rPr>
         <w:t>(</w:t>
       </w:r>
       <w:r>
         <w:rPr>
           <w:sz w:val="20"/>
-        </w:rPr>
-        <w:t xml:space="preserve">FCT </w:t>
-      </w:r>
-      <w:proofErr w:type="spellStart"/>
+          <w:lang w:val="en-US"/>
+        </w:rPr>
+        <w:t xml:space="preserve">FCT Program </w:t>
+      </w:r>
       <w:r>
         <w:rPr>
           <w:sz w:val="20"/>
-        </w:rPr>
-        <w:t>Program</w:t>
-      </w:r>
-      <w:proofErr w:type="spellEnd"/>
-      <w:r>
-        <w:rPr>
-          <w:sz w:val="20"/>
-        </w:rPr>
-        <w:t xml:space="preserve"> </w:t>
-      </w:r>
-      <w:r>
-        <w:rPr>
-          <w:sz w:val="20"/>
+          <w:lang w:val="en-US"/>
         </w:rPr>
         <w:t>2026)</w:t>
       </w:r>
@@ -624,87 +771,22 @@
         <w:jc w:val="both"/>
         <w:rPr>
           <w:szCs w:val="20"/>
+          <w:lang w:val="en-US"/>
         </w:rPr>
       </w:pPr>
       <w:r>
         <w:rPr>
           <w:szCs w:val="20"/>
-        </w:rPr>
-        <w:t xml:space="preserve">Desenvolvimento e manutenção de aplicações web com React, Inertia.js, </w:t>
-      </w:r>
-      <w:proofErr w:type="spellStart"/>
+          <w:lang w:val="en-US"/>
+        </w:rPr>
+        <w:t xml:space="preserve">Development and maintenance of web applications using React, Inertia.js, Laravel, and Tailwind CSS. Implementation of full-stack functionalities, API integration, and working with a modern stack in a professional environment. Use of Git for version control and collaboration, focusing on problem-solving and performance </w:t>
+      </w:r>
       <w:r>
         <w:rPr>
           <w:szCs w:val="20"/>
-        </w:rPr>
-        <w:t>Laravel</w:t>
-      </w:r>
-      <w:proofErr w:type="spellEnd"/>
-      <w:r>
-        <w:rPr>
-          <w:szCs w:val="20"/>
-        </w:rPr>
-        <w:t xml:space="preserve"> e </w:t>
-      </w:r>
-      <w:proofErr w:type="spellStart"/>
-      <w:r>
-        <w:rPr>
-          <w:szCs w:val="20"/>
-        </w:rPr>
-        <w:t>Tailwind</w:t>
-      </w:r>
-      <w:proofErr w:type="spellEnd"/>
-      <w:r>
-        <w:rPr>
-          <w:szCs w:val="20"/>
-        </w:rPr>
-        <w:t xml:space="preserve"> CSS. Implementação de funcionalidades </w:t>
-      </w:r>
-      <w:proofErr w:type="spellStart"/>
-      <w:r>
-        <w:rPr>
-          <w:szCs w:val="20"/>
-        </w:rPr>
-        <w:t>full-stack</w:t>
-      </w:r>
-      <w:proofErr w:type="spellEnd"/>
-      <w:r>
-        <w:rPr>
-          <w:szCs w:val="20"/>
-        </w:rPr>
-        <w:t xml:space="preserve">, integração de APIs e </w:t>
-      </w:r>
-      <w:r>
-        <w:rPr>
-          <w:szCs w:val="20"/>
-        </w:rPr>
-        <w:t xml:space="preserve">trabalho com um </w:t>
-      </w:r>
-      <w:proofErr w:type="spellStart"/>
-      <w:r>
-        <w:rPr>
-          <w:szCs w:val="20"/>
-        </w:rPr>
-        <w:t>stack</w:t>
-      </w:r>
-      <w:proofErr w:type="spellEnd"/>
-      <w:r>
-        <w:rPr>
-          <w:szCs w:val="20"/>
-        </w:rPr>
-        <w:t xml:space="preserve"> moderno</w:t>
-      </w:r>
-      <w:r>
-        <w:rPr>
-          <w:szCs w:val="20"/>
-        </w:rPr>
-        <w:t xml:space="preserve"> </w:t>
-      </w:r>
-      <w:r>
-        <w:rPr>
-          <w:szCs w:val="20"/>
-        </w:rPr>
-        <w:t>em ambiente profissional. Utilização de Git para versionamento e colaboração, com foco na resolução de problemas e melhoria de performance.</w:t>
+          <w:lang w:val="en-US"/>
+        </w:rPr>
+        <w:t>improvement.</w:t>
       </w:r>
     </w:p>
     <w:p>
@@ -713,9 +795,15 @@
         <w:spacing w:line="360" w:lineRule="auto"/>
         <w:ind w:left="16"/>
         <w:jc w:val="both"/>
-      </w:pPr>
-      <w:r>
-        <w:t>Habilidades</w:t>
+        <w:rPr>
+          <w:lang w:val="en-US"/>
+        </w:rPr>
+      </w:pPr>
+      <w:r>
+        <w:rPr>
+          <w:lang w:val="en-US"/>
+        </w:rPr>
+        <w:t>Skills</w:t>
       </w:r>
     </w:p>
     <w:p>
@@ -726,21 +814,24 @@
         <w:rPr>
           <w:sz w:val="28"/>
           <w:szCs w:val="28"/>
+          <w:lang w:val="en-US"/>
         </w:rPr>
       </w:pPr>
       <w:r>
         <w:rPr>
           <w:sz w:val="28"/>
           <w:szCs w:val="28"/>
-        </w:rPr>
-        <w:t>Pr</w:t>
+          <w:lang w:val="en-US"/>
+        </w:rPr>
+        <w:t>T</w:t>
       </w:r>
       <w:r>
         <w:rPr>
           <w:sz w:val="28"/>
           <w:szCs w:val="28"/>
-        </w:rPr>
-        <w:t>oficiência em Línguas</w:t>
+          <w:lang w:val="en-US"/>
+        </w:rPr>
+        <w:t>echnologies I use</w:t>
       </w:r>
     </w:p>
     <w:p>
@@ -750,19 +841,92 @@
         <w:jc w:val="both"/>
         <w:rPr>
           <w:bCs/>
+          <w:lang w:val="en-US"/>
         </w:rPr>
       </w:pPr>
       <w:r>
         <w:rPr>
           <w:bCs/>
-        </w:rPr>
-        <w:t>Python • JavaScript • C# • SQL</w:t>
+          <w:lang w:val="en-US"/>
+        </w:rPr>
+        <w:t xml:space="preserve">Python • JavaScript • C# • </w:t>
       </w:r>
       <w:r>
         <w:rPr>
           <w:bCs/>
-        </w:rPr>
-        <w:t xml:space="preserve">  </w:t>
+          <w:lang w:val="en-US"/>
+        </w:rPr>
+        <w:t>SQL •</w:t>
+      </w:r>
+      <w:r>
+        <w:rPr>
+          <w:bCs/>
+          <w:lang w:val="en-US"/>
+        </w:rPr>
+        <w:t xml:space="preserve"> R</w:t>
+      </w:r>
+      <w:r>
+        <w:rPr>
+          <w:bCs/>
+          <w:lang w:val="en-US"/>
+        </w:rPr>
+        <w:t xml:space="preserve">eact </w:t>
+      </w:r>
+      <w:r>
+        <w:rPr>
+          <w:bCs/>
+          <w:lang w:val="en-US"/>
+        </w:rPr>
+        <w:t>•</w:t>
+      </w:r>
+      <w:r>
+        <w:rPr>
+          <w:bCs/>
+          <w:lang w:val="en-US"/>
+        </w:rPr>
+        <w:t xml:space="preserve"> Electron </w:t>
+      </w:r>
+      <w:r>
+        <w:rPr>
+          <w:bCs/>
+          <w:lang w:val="en-US"/>
+        </w:rPr>
+        <w:t>•</w:t>
+      </w:r>
+      <w:r>
+        <w:rPr>
+          <w:bCs/>
+          <w:lang w:val="en-US"/>
+        </w:rPr>
+        <w:t xml:space="preserve"> TypeScript </w:t>
+      </w:r>
+      <w:r>
+        <w:rPr>
+          <w:bCs/>
+          <w:lang w:val="en-US"/>
+        </w:rPr>
+        <w:t>•</w:t>
+      </w:r>
+      <w:r>
+        <w:rPr>
+          <w:bCs/>
+          <w:lang w:val="en-US"/>
+        </w:rPr>
+        <w:t xml:space="preserve"> </w:t>
+      </w:r>
+      <w:r>
+        <w:rPr>
+          <w:bCs/>
+          <w:lang w:val="en-US"/>
+        </w:rPr>
+        <w:t>Java •</w:t>
+      </w:r>
+      <w:r>
+        <w:rPr>
+          <w:bCs/>
+          <w:lang w:val="en-US"/>
+        </w:rPr>
+        <w:t xml:space="preserve"> PHP</w:t>
       </w:r>
     </w:p>
     <w:p>
@@ -809,11 +973,9 @@
         <w:spacing w:line="360" w:lineRule="auto"/>
         <w:jc w:val="both"/>
       </w:pPr>
-      <w:proofErr w:type="spellStart"/>
       <w:r>
         <w:t>Frontend</w:t>
       </w:r>
-      <w:proofErr w:type="spellEnd"/>
     </w:p>
     <w:p>
       <w:pPr>
@@ -838,7 +1000,7 @@
         <w:jc w:val="both"/>
       </w:pPr>
       <w:r>
-        <w:t>Ferramentas e Ambientes</w:t>
+        <w:t>Tools and environments</w:t>
       </w:r>
     </w:p>
     <w:p>
@@ -867,19 +1029,17 @@
           <w:lang w:val="en-US"/>
         </w:rPr>
       </w:pPr>
-      <w:proofErr w:type="spellStart"/>
-      <w:r>
-        <w:rPr>
-          <w:lang w:val="en-US"/>
-        </w:rPr>
-        <w:t>Conceitos</w:t>
-      </w:r>
-      <w:proofErr w:type="spellEnd"/>
-      <w:r>
-        <w:rPr>
-          <w:lang w:val="en-US"/>
-        </w:rPr>
-        <w:t>:</w:t>
+      <w:r>
+        <w:rPr>
+          <w:lang w:val="en-US"/>
+        </w:rPr>
+        <w:t>Co</w:t>
+      </w:r>
+      <w:r>
+        <w:rPr>
+          <w:lang w:val="en-US"/>
+        </w:rPr>
+        <w:t>ncepts</w:t>
       </w:r>
     </w:p>
     <w:p>
@@ -903,128 +1063,123 @@
         <w:spacing w:line="360" w:lineRule="auto"/>
         <w:ind w:left="0" w:firstLine="0"/>
         <w:jc w:val="both"/>
-        <w:rPr>
-          <w:lang w:val="en-US"/>
-        </w:rPr>
-      </w:pPr>
-      <w:proofErr w:type="spellStart"/>
-      <w:r>
-        <w:rPr>
-          <w:lang w:val="en-US"/>
-        </w:rPr>
-        <w:t>Certificados</w:t>
-      </w:r>
-      <w:proofErr w:type="spellEnd"/>
-      <w:r>
-        <w:rPr>
-          <w:lang w:val="en-US"/>
-        </w:rPr>
-        <w:t xml:space="preserve"> e </w:t>
-      </w:r>
-      <w:proofErr w:type="spellStart"/>
-      <w:r>
-        <w:rPr>
-          <w:lang w:val="en-US"/>
-        </w:rPr>
-        <w:t>Cursos</w:t>
-      </w:r>
-      <w:proofErr w:type="spellEnd"/>
+      </w:pPr>
+      <w:r>
+        <w:t>Certificates and Complementary Courses</w:t>
+      </w:r>
+    </w:p>
+    <w:p>
+      <w:pPr>
+        <w:spacing w:line="360" w:lineRule="auto"/>
+        <w:ind w:firstLine="31"/>
+        <w:jc w:val="both"/>
+        <w:rPr>
+          <w:lang w:val="en-US"/>
+        </w:rPr>
+      </w:pPr>
+      <w:r>
+        <w:rPr>
+          <w:lang w:val="en-US"/>
+        </w:rPr>
+        <w:t xml:space="preserve">JavaScript Essentials 1 • Python Essentials 2 • IT Essentials </w:t>
+      </w:r>
+      <w:r>
+        <w:rPr>
+          <w:lang w:val="en-US"/>
+        </w:rPr>
+        <w:t>• Introduction to Data Science • Apply AI: Update Your Resume</w:t>
+      </w:r>
+    </w:p>
+    <w:p>
+      <w:pPr>
+        <w:pStyle w:val="Ttulo2"/>
+        <w:spacing w:line="360" w:lineRule="auto"/>
+        <w:rPr>
+          <w:lang w:val="en-US"/>
+        </w:rPr>
+      </w:pPr>
+      <w:r>
+        <w:rPr>
+          <w:lang w:val="en-US"/>
+        </w:rPr>
+        <w:t>P</w:t>
+      </w:r>
+      <w:r>
+        <w:rPr>
+          <w:lang w:val="en-US"/>
+        </w:rPr>
+        <w:t>ersonal skills</w:t>
+      </w:r>
+    </w:p>
+    <w:p>
+      <w:pPr>
+        <w:spacing w:line="360" w:lineRule="auto"/>
+        <w:rPr>
+          <w:lang w:val="en-US"/>
+        </w:rPr>
+      </w:pPr>
+      <w:r>
+        <w:rPr>
+          <w:lang w:val="en-US"/>
+        </w:rPr>
+        <w:t>Clear and empathetic communication • Ease in interacting with clients • Team spirit • Organization and responsibility • Adaptability • Quick learning • Stress management and calm demeanor</w:t>
+      </w:r>
+    </w:p>
+    <w:p>
+      <w:pPr>
+        <w:pStyle w:val="Ttulo2"/>
+      </w:pPr>
+      <w:r>
+        <w:t>Languages</w:t>
+      </w:r>
+    </w:p>
+    <w:p>
+      <w:pPr>
+        <w:rPr>
+          <w:lang w:val="en-US"/>
+        </w:rPr>
+      </w:pPr>
+      <w:r>
+        <w:rPr>
+          <w:lang w:val="en-US"/>
+        </w:rPr>
+        <w:t>P</w:t>
+      </w:r>
+      <w:r>
+        <w:rPr>
+          <w:lang w:val="en-US"/>
+        </w:rPr>
+        <w:t>ortuguese (Native)</w:t>
+      </w:r>
       <w:r>
         <w:rPr>
           <w:lang w:val="en-US"/>
         </w:rPr>
         <w:t xml:space="preserve"> </w:t>
       </w:r>
-      <w:proofErr w:type="spellStart"/>
-      <w:r>
-        <w:rPr>
-          <w:lang w:val="en-US"/>
-        </w:rPr>
-        <w:t>Complementares</w:t>
-      </w:r>
-      <w:proofErr w:type="spellEnd"/>
-    </w:p>
-    <w:p>
-      <w:pPr>
-        <w:spacing w:line="360" w:lineRule="auto"/>
-        <w:ind w:firstLine="31"/>
-        <w:jc w:val="both"/>
-        <w:rPr>
-          <w:lang w:val="en-US"/>
-        </w:rPr>
-      </w:pPr>
-      <w:r>
-        <w:rPr>
-          <w:lang w:val="en-US"/>
-        </w:rPr>
-        <w:t xml:space="preserve">JavaScript Essentials 1 • Python Essentials 2 • IT Essentials </w:t>
-      </w:r>
-      <w:r>
-        <w:rPr>
-          <w:lang w:val="en-US"/>
-        </w:rPr>
-        <w:t>• Introduction to Data Science • Apply AI: Update Your Resume</w:t>
-      </w:r>
-    </w:p>
-    <w:p>
-      <w:pPr>
-        <w:pStyle w:val="Ttulo2"/>
-      </w:pPr>
-      <w:r>
-        <w:t>Competências Pessoais</w:t>
-      </w:r>
-    </w:p>
-    <w:p>
-      <w:r>
-        <w:t>Comunicação clara e empática</w:t>
-      </w:r>
-      <w:r>
-        <w:t xml:space="preserve"> </w:t>
-      </w:r>
-      <w:r>
+      <w:r>
+        <w:rPr>
+          <w:lang w:val="en-US"/>
+        </w:rPr>
         <w:t>•</w:t>
       </w:r>
       <w:r>
-        <w:t xml:space="preserve"> </w:t>
-      </w:r>
-      <w:r>
-        <w:t>Facilidade no contacto com clientes</w:t>
-      </w:r>
-      <w:r>
-        <w:t xml:space="preserve"> </w:t>
-      </w:r>
-      <w:r>
+        <w:rPr>
+          <w:lang w:val="en-US"/>
+        </w:rPr>
+        <w:t xml:space="preserve"> English (Basic) </w:t>
+      </w:r>
+      <w:r>
+        <w:rPr>
+          <w:lang w:val="en-US"/>
+        </w:rPr>
         <w:t>•</w:t>
       </w:r>
       <w:r>
-        <w:t xml:space="preserve"> </w:t>
-      </w:r>
-      <w:r>
-        <w:t>Espírito de equipa</w:t>
-      </w:r>
-      <w:r>
-        <w:t xml:space="preserve"> </w:t>
-      </w:r>
-      <w:r>
-        <w:t>• Organização e responsabilidade</w:t>
-      </w:r>
-      <w:r>
-        <w:t xml:space="preserve"> </w:t>
-      </w:r>
-      <w:r>
-        <w:t>• Capacidade de adaptação</w:t>
-      </w:r>
-      <w:r>
-        <w:t xml:space="preserve"> </w:t>
-      </w:r>
-      <w:r>
-        <w:t>• Aprendizagem rápida</w:t>
-      </w:r>
-      <w:r>
-        <w:t xml:space="preserve"> </w:t>
-      </w:r>
-      <w:r>
-        <w:t>• Gestão de stress e postura calma</w:t>
+        <w:rPr>
+          <w:lang w:val="en-US"/>
+        </w:rPr>
+        <w:t xml:space="preserve"> Spanish (Basic)</w:t>
       </w:r>
     </w:p>
     <w:sectPr>

</xml_diff>